<commit_message>
Expand adapted scripts for three videos
</commit_message>
<xml_diff>
--- a/deliverables/暮言/改编脚本.docx
+++ b/deliverables/暮言/改编脚本.docx
@@ -7,584 +7,852 @@
         <w:pStyle w:val="Title"/>
       </w:pPr>
       <w:r>
-        <w:t>剧名：《如果还能再陪她一天》</w:t>
+        <w:t>如果还能再陪她一天</w:t>
       </w:r>
     </w:p>
     <w:p>
-      <w:pPr>
-        <w:pStyle w:val="Heading1"/>
-      </w:pPr>
-      <w:r>
-        <w:t>整体剧情概括</w:t>
+      <w:r>
+        <w:t>剧名：《如果还能再陪她一天》</w:t>
       </w:r>
     </w:p>
     <w:p>
       <w:r>
-        <w:t>成年后的周然在整理旧屋时翻出一张外婆年轻时带他赶集的照片。当晚，他意外“回到”十五年前的夏天，重新见到还健康、还会唠叨、还总把好东西留给他的外婆。周然明知这一天终究留不住，却还是拼命把现实里没来得及做的关心补回去：陪她赶集、替她买药、塞钱、提醒复查、陪她吃完那顿最熟悉的家常饭。等他终于明白这不是命运恩赐，而是告别前最后一次补偿时，天已经亮了。</w:t>
+        <w:t>整体剧情概括：</w:t>
+      </w:r>
+      <w:r>
+        <w:br/>
+      </w:r>
+      <w:r>
+        <w:t>周然三十二岁，常年在外工作，外婆去世后，他一次都没敢回那间老屋。直到老房子准备翻修，他被迫回去清理旧物，翻出一张外婆年轻时带他赶集的旧照片。那天夜里，他像被照片拽回了十五年前，重新见到了还会骂他贪玩、会把鸡腿夹进他碗里、会偷偷忍着头疼不去看病的外婆。这不是一场简单的重逢，而是一场迟到了很多年的补偿。周然知道这一天留不住，于是他拼命把现实里没来得及做的事提前做完：陪她赶集，替她买药，抢着烧火做饭，把钱塞进她围裙口袋，盯着她记住复查时间，最后再抱她一次。</w:t>
       </w:r>
     </w:p>
     <w:p>
-      <w:pPr>
-        <w:pStyle w:val="Heading1"/>
-      </w:pPr>
-      <w:r>
-        <w:t>第一集</w:t>
+      <w:r>
+        <w:t>第一集：回到那顿再也没吃上的晚饭</w:t>
       </w:r>
     </w:p>
     <w:p>
-      <w:pPr>
-        <w:pStyle w:val="Heading2"/>
-      </w:pPr>
       <w:r>
         <w:t>1-1 夜 内 老屋杂物间</w:t>
+      </w:r>
+      <w:r>
+        <w:br/>
+      </w:r>
+      <w:r>
+        <w:t>△ 周然一个人蹲在堆满旧箱子的杂物间里，灰尘被手电筒光柱打得四处漂浮。</w:t>
+      </w:r>
+      <w:r>
+        <w:br/>
+      </w:r>
+      <w:r>
+        <w:t>△ 他翻出一只掉漆铁盒，里面压着旧车票、粮票、外婆的针线包，最底下是一张泛黄照片。</w:t>
+      </w:r>
+      <w:r>
+        <w:br/>
+      </w:r>
+      <w:r>
+        <w:t>△ 照片里，外婆穿着旧碎花衫，牵着七岁的他站在集市口，背后是卖糖画和风扇帽的小摊。</w:t>
+      </w:r>
+      <w:r>
+        <w:br/>
+      </w:r>
+      <w:r>
+        <w:t>周然（低声）：你怎么还留着这张……</w:t>
+      </w:r>
+      <w:r>
+        <w:br/>
+      </w:r>
+      <w:r>
+        <w:t>周然（坐在地上，笑了一下又红眼）：外婆，我都快忘了你那天穿啥颜色衣服了。</w:t>
+      </w:r>
+      <w:r>
+        <w:br/>
+      </w:r>
+      <w:r>
+        <w:t>周然：要是能再见你一次就好了，哪怕就一天。</w:t>
+      </w:r>
+      <w:r>
+        <w:br/>
+      </w:r>
+      <w:r>
+        <w:t>△ 风从窗缝灌进来，照片背面一角像被人摸过，起了边。</w:t>
       </w:r>
     </w:p>
     <w:p>
       <w:r>
-        <w:t>△ 周然独自整理老屋，灰尘飞起，旧木柜里掉出一张泛黄照片。</w:t>
+        <w:t>1-2 日 外 乡间土路</w:t>
+      </w:r>
+      <w:r>
+        <w:br/>
+      </w:r>
+      <w:r>
+        <w:t>△ 刺眼天光晃过，周然猛地从土路边坐起，耳边是蝉鸣、自行车铃和有人吆喝卖冰棍的声音。</w:t>
+      </w:r>
+      <w:r>
+        <w:br/>
+      </w:r>
+      <w:r>
+        <w:t>△ 一个扎羊角辫的小女孩蹲在旁边，手里攥着一根狗尾巴草，警惕又好奇地盯着他。</w:t>
+      </w:r>
+      <w:r>
+        <w:br/>
+      </w:r>
+      <w:r>
+        <w:t>△ 周然抬头，看见还没被拆掉的老砖房和那棵老槐树，整个人一下僵住。</w:t>
+      </w:r>
+      <w:r>
+        <w:br/>
+      </w:r>
+      <w:r>
+        <w:t>小女孩：你咋躺这儿啊？是不是中暑了？</w:t>
+      </w:r>
+      <w:r>
+        <w:br/>
+      </w:r>
+      <w:r>
+        <w:t>周然（怔住）：念念？</w:t>
+      </w:r>
+      <w:r>
+        <w:br/>
+      </w:r>
+      <w:r>
+        <w:t>小女孩：你认识我？</w:t>
+      </w:r>
+      <w:r>
+        <w:br/>
+      </w:r>
+      <w:r>
+        <w:t>周然（喃喃）：这不是……十五年前吗？</w:t>
+      </w:r>
+      <w:r>
+        <w:br/>
+      </w:r>
+      <w:r>
+        <w:t>小女孩：你说啥呢？你要不要喝水？</w:t>
+      </w:r>
+      <w:r>
+        <w:br/>
+      </w:r>
+      <w:r>
+        <w:t>周然（接过水，眼眶发热）：要。</w:t>
       </w:r>
     </w:p>
     <w:p>
       <w:r>
-        <w:t>△ 照片里，年轻时的外婆牵着七八岁的他，站在集市口，笑得很亮。</w:t>
+        <w:t>1-3 日 外 去集市的路上</w:t>
+      </w:r>
+      <w:r>
+        <w:br/>
+      </w:r>
+      <w:r>
+        <w:t>△ 念念提着竹篮往前走，周然像怕一眨眼就会醒，紧紧跟着她。</w:t>
+      </w:r>
+      <w:r>
+        <w:br/>
+      </w:r>
+      <w:r>
+        <w:t>△ 她一路碎碎念，说外婆今天要去赶集、要买盐、要买灯芯，还说自己想买糖片但不敢开口。</w:t>
+      </w:r>
+      <w:r>
+        <w:br/>
+      </w:r>
+      <w:r>
+        <w:t>△ 周然一边听，一边把每个细节和记忆对上，像重新走进自己早就失去的童年。</w:t>
+      </w:r>
+      <w:r>
+        <w:br/>
+      </w:r>
+      <w:r>
+        <w:t>念念：你别老盯着我看，怪吓人的。</w:t>
+      </w:r>
+      <w:r>
+        <w:br/>
+      </w:r>
+      <w:r>
+        <w:t>周然（笑）：我是在想，你小时候比我记得的还瘦。</w:t>
+      </w:r>
+      <w:r>
+        <w:br/>
+      </w:r>
+      <w:r>
+        <w:t>念念：你怎么老说我小时候？</w:t>
+      </w:r>
+      <w:r>
+        <w:br/>
+      </w:r>
+      <w:r>
+        <w:t>周然：因为我认识长大后的你。</w:t>
+      </w:r>
+      <w:r>
+        <w:br/>
+      </w:r>
+      <w:r>
+        <w:t>念念：你这人说话神神叨叨的。</w:t>
+      </w:r>
+      <w:r>
+        <w:br/>
+      </w:r>
+      <w:r>
+        <w:t>周然：那你今天是不是想买山楂片？</w:t>
+      </w:r>
+      <w:r>
+        <w:br/>
+      </w:r>
+      <w:r>
+        <w:t>念念（愣住）：你咋知道？</w:t>
+      </w:r>
+      <w:r>
+        <w:br/>
+      </w:r>
+      <w:r>
+        <w:t>周然：还想要那个小风扇帽，和玻璃弹珠。</w:t>
+      </w:r>
+      <w:r>
+        <w:br/>
+      </w:r>
+      <w:r>
+        <w:t>念念：你偷听我说话了？</w:t>
+      </w:r>
+      <w:r>
+        <w:br/>
+      </w:r>
+      <w:r>
+        <w:t>周然：没有，我就是知道。</w:t>
       </w:r>
     </w:p>
     <w:p>
       <w:r>
-        <w:t>△ 周然盯着照片失神，指腹轻轻擦过照片边角已经卷起的裂痕。</w:t>
+        <w:t>1-4 日 外 集市口</w:t>
+      </w:r>
+      <w:r>
+        <w:br/>
+      </w:r>
+      <w:r>
+        <w:t>△ 集市热闹，布摊、药铺、肉案、糖画摊全挤在一条街上。</w:t>
+      </w:r>
+      <w:r>
+        <w:br/>
+      </w:r>
+      <w:r>
+        <w:t>△ 念念嘴硬说不买，眼神却一步三回头。周然故作轻松，把她想要的东西一口气全买下来。</w:t>
+      </w:r>
+      <w:r>
+        <w:br/>
+      </w:r>
+      <w:r>
+        <w:t>△ 这场戏的重点不是宠小孩，而是周然第一次真正感到“我还能补一点”。</w:t>
+      </w:r>
+      <w:r>
+        <w:br/>
+      </w:r>
+      <w:r>
+        <w:t>周然（对摊主）：山楂片来两包，糖块称半斤，那个带小风扇的帽子拿一个。</w:t>
+      </w:r>
+      <w:r>
+        <w:br/>
+      </w:r>
+      <w:r>
+        <w:t>念念：别买了，我婆婆知道会骂我的。</w:t>
+      </w:r>
+      <w:r>
+        <w:br/>
+      </w:r>
+      <w:r>
+        <w:t>周然：那就说是我缠着你买的。</w:t>
+      </w:r>
+      <w:r>
+        <w:br/>
+      </w:r>
+      <w:r>
+        <w:t>念念：你谁啊你？</w:t>
+      </w:r>
+      <w:r>
+        <w:br/>
+      </w:r>
+      <w:r>
+        <w:t>周然：一个欠你们家很多的人。</w:t>
+      </w:r>
+      <w:r>
+        <w:br/>
+      </w:r>
+      <w:r>
+        <w:t>念念：你真怪。</w:t>
+      </w:r>
+      <w:r>
+        <w:br/>
+      </w:r>
+      <w:r>
+        <w:t>周然：那你高兴没？</w:t>
+      </w:r>
+      <w:r>
+        <w:br/>
+      </w:r>
+      <w:r>
+        <w:t>念念（压着笑）：……有一点。</w:t>
       </w:r>
     </w:p>
     <w:p>
       <w:r>
-        <w:t>周然（低声）：外婆，我好像很久没梦见你了。</w:t>
+        <w:t>1-5 日 外 旧药铺门口</w:t>
+      </w:r>
+      <w:r>
+        <w:br/>
+      </w:r>
+      <w:r>
+        <w:t>△ 经过药铺时，周然突然停住。他看见外婆扶着门框，正拿着一张药单犹豫，像在算钱够不够。</w:t>
+      </w:r>
+      <w:r>
+        <w:br/>
+      </w:r>
+      <w:r>
+        <w:t>△ 她没什么大病样子，只是脸色发白，额角冒汗，像是头疼又犯了。</w:t>
+      </w:r>
+      <w:r>
+        <w:br/>
+      </w:r>
+      <w:r>
+        <w:t>△ 周然上辈子没看到这一幕，这一世一眼就明白，她当年不是没病，是舍不得花钱。</w:t>
+      </w:r>
+      <w:r>
+        <w:br/>
+      </w:r>
+      <w:r>
+        <w:t>外婆：小周？你咋在这儿？</w:t>
+      </w:r>
+      <w:r>
+        <w:br/>
+      </w:r>
+      <w:r>
+        <w:t>周然（眼圈一下红了）：路过。</w:t>
+      </w:r>
+      <w:r>
+        <w:br/>
+      </w:r>
+      <w:r>
+        <w:t>外婆：你这孩子，咋一见我就跟受委屈似的。</w:t>
+      </w:r>
+      <w:r>
+        <w:br/>
+      </w:r>
+      <w:r>
+        <w:t>周然：风大，迷眼了。</w:t>
+      </w:r>
+      <w:r>
+        <w:br/>
+      </w:r>
+      <w:r>
+        <w:t>外婆：少来，你小时候撒谎就这德行。</w:t>
+      </w:r>
+      <w:r>
+        <w:br/>
+      </w:r>
+      <w:r>
+        <w:t>周然（怔住）：你还记得？</w:t>
+      </w:r>
+      <w:r>
+        <w:br/>
+      </w:r>
+      <w:r>
+        <w:t>外婆：我记不得谁，也记得你。</w:t>
       </w:r>
     </w:p>
     <w:p>
       <w:r>
-        <w:t>周然（哽住）：要是能再见你一次就好了。</w:t>
-      </w:r>
-    </w:p>
-    <w:p/>
-    <w:p>
-      <w:pPr>
-        <w:pStyle w:val="Heading2"/>
-      </w:pPr>
-      <w:r>
-        <w:t>1-2 日 外 乡间土路</w:t>
+        <w:t>1-6 日 内 药铺</w:t>
+      </w:r>
+      <w:r>
+        <w:br/>
+      </w:r>
+      <w:r>
+        <w:t>△ 周然抢过药单，顺手多拿了止疼贴、钙片和一支红花油。</w:t>
+      </w:r>
+      <w:r>
+        <w:br/>
+      </w:r>
+      <w:r>
+        <w:t>△ 外婆一边拦，一边嫌他乱花钱，可眼神里全是那种老人心疼小辈又不舍得真的拒绝的劲儿。</w:t>
+      </w:r>
+      <w:r>
+        <w:br/>
+      </w:r>
+      <w:r>
+        <w:t>周然：这些也一起装上。</w:t>
+      </w:r>
+      <w:r>
+        <w:br/>
+      </w:r>
+      <w:r>
+        <w:t>外婆：买那么多干啥？我熬一熬就过去了。</w:t>
+      </w:r>
+      <w:r>
+        <w:br/>
+      </w:r>
+      <w:r>
+        <w:t>周然：疼就不是小事。</w:t>
+      </w:r>
+      <w:r>
+        <w:br/>
+      </w:r>
+      <w:r>
+        <w:t>外婆：你哪来的钱？</w:t>
+      </w:r>
+      <w:r>
+        <w:br/>
+      </w:r>
+      <w:r>
+        <w:t>周然：长大以后攒的。</w:t>
+      </w:r>
+      <w:r>
+        <w:br/>
+      </w:r>
+      <w:r>
+        <w:t>外婆（笑骂）：又说胡话。</w:t>
+      </w:r>
+      <w:r>
+        <w:br/>
+      </w:r>
+      <w:r>
+        <w:t>周然：我没胡话。以前没人替你买，我现在补上。</w:t>
+      </w:r>
+      <w:r>
+        <w:br/>
+      </w:r>
+      <w:r>
+        <w:t>外婆（没听清）：你说啥？</w:t>
+      </w:r>
+      <w:r>
+        <w:br/>
+      </w:r>
+      <w:r>
+        <w:t>周然（低头笑）：我说，今天我请。</w:t>
       </w:r>
     </w:p>
     <w:p>
       <w:r>
-        <w:t>△ 强光晃过眼睛，周然猛地从土路边醒来，耳边是蝉鸣和自行车铃。</w:t>
+        <w:t>1-7 傍晚 内 老屋灶间</w:t>
+      </w:r>
+      <w:r>
+        <w:br/>
+      </w:r>
+      <w:r>
+        <w:t>△ 回到家，外婆系上围裙准备做饭。周然像怕时间跑掉似的，一直围着灶台转，抢着淘米、添柴、端菜。</w:t>
+      </w:r>
+      <w:r>
+        <w:br/>
+      </w:r>
+      <w:r>
+        <w:t>△ 念念坐在门槛上吃山楂片，看他们俩忙成一团，屋子里全是锅铲声和油烟气。</w:t>
+      </w:r>
+      <w:r>
+        <w:br/>
+      </w:r>
+      <w:r>
+        <w:t>外婆：你今天咋这么勤快？</w:t>
+      </w:r>
+      <w:r>
+        <w:br/>
+      </w:r>
+      <w:r>
+        <w:t>周然：以前没来得及勤快。</w:t>
+      </w:r>
+      <w:r>
+        <w:br/>
+      </w:r>
+      <w:r>
+        <w:t>外婆：你才多大，讲得跟活过两辈子似的。</w:t>
+      </w:r>
+      <w:r>
+        <w:br/>
+      </w:r>
+      <w:r>
+        <w:t>念念：我就说他怪吧。</w:t>
+      </w:r>
+      <w:r>
+        <w:br/>
+      </w:r>
+      <w:r>
+        <w:t>周然（笑）：我怪，你们收留一下。</w:t>
+      </w:r>
+      <w:r>
+        <w:br/>
+      </w:r>
+      <w:r>
+        <w:t>外婆：行，怪人也得先把柴火抱进来。</w:t>
+      </w:r>
+      <w:r>
+        <w:br/>
+      </w:r>
+      <w:r>
+        <w:t>△ 三个人的气氛开始像真正的一家人，而不是谁突然闯进来借住的一天。</w:t>
       </w:r>
     </w:p>
     <w:p>
       <w:r>
-        <w:t>△ 一个扎羊角辫的小女孩蹲在他面前，好奇地看着他。</w:t>
+        <w:t>1-8 夜 内 饭桌前</w:t>
+      </w:r>
+      <w:r>
+        <w:br/>
+      </w:r>
+      <w:r>
+        <w:t>△ 菜端上桌，不过是蒜苗炒肉、清炒南瓜、咸菜和一碗蛋花汤，可周然吃第一口就红了眼。</w:t>
+      </w:r>
+      <w:r>
+        <w:br/>
+      </w:r>
+      <w:r>
+        <w:t>△ 外婆先是装作没看见，后来还是忍不住开口问他是不是饭菜不合口。</w:t>
+      </w:r>
+      <w:r>
+        <w:br/>
+      </w:r>
+      <w:r>
+        <w:t>外婆：愣着干啥，吃啊。</w:t>
+      </w:r>
+      <w:r>
+        <w:br/>
+      </w:r>
+      <w:r>
+        <w:t>周然：你炒的蒜苗肉还是这个味儿。</w:t>
+      </w:r>
+      <w:r>
+        <w:br/>
+      </w:r>
+      <w:r>
+        <w:t>外婆：什么叫“还是”？我一直就这味儿。</w:t>
+      </w:r>
+      <w:r>
+        <w:br/>
+      </w:r>
+      <w:r>
+        <w:t>念念：他说话老像认识咱很久了。</w:t>
+      </w:r>
+      <w:r>
+        <w:br/>
+      </w:r>
+      <w:r>
+        <w:t>周然（低头吃了一口）：太久了。</w:t>
+      </w:r>
+      <w:r>
+        <w:br/>
+      </w:r>
+      <w:r>
+        <w:t>外婆：菜不好吃？</w:t>
+      </w:r>
+      <w:r>
+        <w:br/>
+      </w:r>
+      <w:r>
+        <w:t>周然（喉咙发紧）：好吃。就是……吃着像回家了。</w:t>
+      </w:r>
+      <w:r>
+        <w:br/>
+      </w:r>
+      <w:r>
+        <w:t>外婆：那你以后常来，我给你做。</w:t>
+      </w:r>
+      <w:r>
+        <w:br/>
+      </w:r>
+      <w:r>
+        <w:t>周然：嗯，我一定常来。</w:t>
+      </w:r>
+      <w:r>
+        <w:br/>
+      </w:r>
+      <w:r>
+        <w:t>△ 他说“常来”的时候自己都知道，这是最晚的一句承诺。</w:t>
       </w:r>
     </w:p>
     <w:p>
       <w:r>
-        <w:t>△ 周然抬头，看见远处还是没拆的老砖房和记忆里的槐树。</w:t>
+        <w:t>1-9 夜 内 迟到的叮嘱</w:t>
+      </w:r>
+      <w:r>
+        <w:br/>
+      </w:r>
+      <w:r>
+        <w:t>△ 饭后，念念去院里玩，外婆收拾碗筷。周然趁她不注意，把准备好的纸条和钱塞进她围裙口袋。</w:t>
+      </w:r>
+      <w:r>
+        <w:br/>
+      </w:r>
+      <w:r>
+        <w:t>△ 纸条上写着复查时间、药量和一句“头疼别忍”。</w:t>
+      </w:r>
+      <w:r>
+        <w:br/>
+      </w:r>
+      <w:r>
+        <w:t>外婆发现了，没有立刻揭穿，只把围裙按住，抬头看了他很久。</w:t>
+      </w:r>
+      <w:r>
+        <w:br/>
+      </w:r>
+      <w:r>
+        <w:t>周然：以后头疼了别扛，记得去镇上复查。</w:t>
+      </w:r>
+      <w:r>
+        <w:br/>
+      </w:r>
+      <w:r>
+        <w:t>外婆：你怎么啥都知道？</w:t>
+      </w:r>
+      <w:r>
+        <w:br/>
+      </w:r>
+      <w:r>
+        <w:t>周然：因为我后悔过。</w:t>
+      </w:r>
+      <w:r>
+        <w:br/>
+      </w:r>
+      <w:r>
+        <w:t>外婆：人这一辈子，哪能样样都赶上。</w:t>
+      </w:r>
+      <w:r>
+        <w:br/>
+      </w:r>
+      <w:r>
+        <w:t>周然：可我总觉得，我欠你的太多了。</w:t>
+      </w:r>
+      <w:r>
+        <w:br/>
+      </w:r>
+      <w:r>
+        <w:t>外婆（轻轻笑）：一家人哪有欠不欠的。</w:t>
+      </w:r>
+      <w:r>
+        <w:br/>
+      </w:r>
+      <w:r>
+        <w:t>周然：有的。有些话没说，有些路没陪，有些病没早点带你去看，这些都算。</w:t>
+      </w:r>
+      <w:r>
+        <w:br/>
+      </w:r>
+      <w:r>
+        <w:t>外婆（沉默片刻）：那你今天不是回来了吗？</w:t>
+      </w:r>
+      <w:r>
+        <w:br/>
+      </w:r>
+      <w:r>
+        <w:t>△ 这句话像是原谅，也像是在提醒他，爱不是只能在失去后才开始算账。</w:t>
       </w:r>
     </w:p>
     <w:p>
       <w:r>
-        <w:t>小女孩：你咋躺这儿啊？是不是中暑了？</w:t>
+        <w:t>1-10 夜 外 院门口</w:t>
+      </w:r>
+      <w:r>
+        <w:br/>
+      </w:r>
+      <w:r>
+        <w:t>△ 夜深了，老槐树叶子被风吹得簌簌响。周然忽然开始不安，他知道这一天快结束了。</w:t>
+      </w:r>
+      <w:r>
+        <w:br/>
+      </w:r>
+      <w:r>
+        <w:t>△ 他站在院门口看着外婆给念念掖被角，像看见自己生命里最温暖、也最无力挽留的一块地方。</w:t>
+      </w:r>
+      <w:r>
+        <w:br/>
+      </w:r>
+      <w:r>
+        <w:t>周然：外婆。</w:t>
+      </w:r>
+      <w:r>
+        <w:br/>
+      </w:r>
+      <w:r>
+        <w:t>外婆：嗯？</w:t>
+      </w:r>
+      <w:r>
+        <w:br/>
+      </w:r>
+      <w:r>
+        <w:t>周然：你别走太早，好不好？</w:t>
+      </w:r>
+      <w:r>
+        <w:br/>
+      </w:r>
+      <w:r>
+        <w:t>外婆（愣了愣）：人哪有不走的。</w:t>
+      </w:r>
+      <w:r>
+        <w:br/>
+      </w:r>
+      <w:r>
+        <w:t>周然：那你等等我，至少等等我学会怎么好好爱你。</w:t>
+      </w:r>
+      <w:r>
+        <w:br/>
+      </w:r>
+      <w:r>
+        <w:t>外婆：傻孩子，想我了，就回来看看这棵槐树。</w:t>
+      </w:r>
+      <w:r>
+        <w:br/>
+      </w:r>
+      <w:r>
+        <w:t>周然（突然抱住她）：我怕我以后再也抱不着了。</w:t>
+      </w:r>
+      <w:r>
+        <w:br/>
+      </w:r>
+      <w:r>
+        <w:t>外婆先是一怔，随后慢慢抬手拍他的背。</w:t>
+      </w:r>
+      <w:r>
+        <w:br/>
+      </w:r>
+      <w:r>
+        <w:t>外婆：抱得着。你记着，我疼过你，这就够你走很远了。</w:t>
       </w:r>
     </w:p>
     <w:p>
       <w:r>
-        <w:t>周然（怔住）：念念？</w:t>
+        <w:t>1-11 清晨 内 老屋杂物间</w:t>
+      </w:r>
+      <w:r>
+        <w:br/>
+      </w:r>
+      <w:r>
+        <w:t>△ 天光微亮，周然猛地从杂物间惊醒，手里还死死攥着那张旧照片。</w:t>
+      </w:r>
+      <w:r>
+        <w:br/>
+      </w:r>
+      <w:r>
+        <w:t>△ 他喘着气翻过照片，发现背面多了一行昨天没有的字，字迹歪斜，却分明是外婆的手。</w:t>
+      </w:r>
+      <w:r>
+        <w:br/>
+      </w:r>
+      <w:r>
+        <w:t>△ 上面写着：别总觉得来不及。想爱，就早点说。</w:t>
+      </w:r>
+      <w:r>
+        <w:br/>
+      </w:r>
+      <w:r>
+        <w:t>周然盯着那行字，眼泪一下掉下来，终于不是崩溃，而像真的被听见了。</w:t>
+      </w:r>
+      <w:r>
+        <w:br/>
+      </w:r>
+      <w:r>
+        <w:t>周然（含着泪笑）：这次……我记住了。</w:t>
       </w:r>
     </w:p>
     <w:p>
       <w:r>
-        <w:t>小女孩：你认识我？</w:t>
+        <w:t>【角色分析】</w:t>
+      </w:r>
+      <w:r>
+        <w:br/>
+      </w:r>
+      <w:r>
+        <w:t>• 周然：不是简单穿越者，而是一个带着成年亏欠重新闯回旧时光的人。他的每个动作都带着补偿心理。</w:t>
+      </w:r>
+      <w:r>
+        <w:br/>
+      </w:r>
+      <w:r>
+        <w:t>• 外婆：不是“被怀念的人”，而是整部戏真正稳住情感的核心。她越家常，越动人。</w:t>
+      </w:r>
+      <w:r>
+        <w:br/>
+      </w:r>
+      <w:r>
+        <w:t>• 念念：小女孩线让故事多了一层轻和亮，也让周然能先通过“陪小孩”重新靠近这个家。</w:t>
       </w:r>
     </w:p>
     <w:p>
       <w:r>
-        <w:t>周然（看着四周）：这不是……十五年前吗？</w:t>
-      </w:r>
-    </w:p>
-    <w:p/>
-    <w:p>
-      <w:pPr>
-        <w:pStyle w:val="Heading2"/>
-      </w:pPr>
-      <w:r>
-        <w:t>1-3 日 外 集市口</w:t>
+        <w:t>【教育意义/文化价值】</w:t>
+      </w:r>
+      <w:r>
+        <w:br/>
+      </w:r>
+      <w:r>
+        <w:t>• 真正打人的亲情戏，往往不是大哭大喊，而是买药、做饭、塞钱、提醒复查这种小动作。</w:t>
+      </w:r>
+      <w:r>
+        <w:br/>
+      </w:r>
+      <w:r>
+        <w:t>• 用老屋、集市、灶间、饭桌这些高识别生活空间承接情绪，落地感会很强。</w:t>
+      </w:r>
+      <w:r>
+        <w:br/>
+      </w:r>
+      <w:r>
+        <w:t>• 结尾不是单纯说教，而是用一句留在旧照片背后的话温柔收口，更耐回味。</w:t>
       </w:r>
     </w:p>
     <w:p>
       <w:r>
-        <w:t>△ 周然跟着小女孩往集市走，一路盯着每一处熟悉又不敢碰的景象。</w:t>
+        <w:t>【核心爆点】</w:t>
+      </w:r>
+      <w:r>
+        <w:br/>
+      </w:r>
+      <w:r>
+        <w:t>• 时空错位只是入口，迟到的补偿才是主钩子。</w:t>
+      </w:r>
+      <w:r>
+        <w:br/>
+      </w:r>
+      <w:r>
+        <w:t>• 中段饭桌和药铺两场戏最容易打中人，因为都是现实里最常来不及做好的事。</w:t>
+      </w:r>
+      <w:r>
+        <w:br/>
+      </w:r>
+      <w:r>
+        <w:t>• “别总觉得来不及”会让观众自动代入自己的遗憾关系。</w:t>
       </w:r>
     </w:p>
     <w:p>
       <w:r>
-        <w:t>△ 集市口小摊林立，风扇帽、玻璃弹珠、山楂片、花布兜全挤在一块。</w:t>
+        <w:t>【技术参数】</w:t>
+      </w:r>
+      <w:r>
+        <w:br/>
+      </w:r>
+      <w:r>
+        <w:t>时长：4-5分钟</w:t>
+      </w:r>
+      <w:r>
+        <w:br/>
+      </w:r>
+      <w:r>
+        <w:t>类型：现实幻想 / 亲情治愈 / 迟到补偿</w:t>
+      </w:r>
+      <w:r>
+        <w:br/>
+      </w:r>
+      <w:r>
+        <w:t>主要场景：老屋杂物间 / 土路 / 集市 / 药铺 / 灶间 / 饭桌 / 院门口</w:t>
+      </w:r>
+      <w:r>
+        <w:br/>
+      </w:r>
+      <w:r>
+        <w:t>改编关键词：回到过去、外婆、迟到关心、旧照片、饭桌、体检</w:t>
       </w:r>
     </w:p>
     <w:p>
       <w:r>
-        <w:t>△ 小女孩嘴上说不用，眼神却忍不住往糖画和转盘玩具上飘。</w:t>
-      </w:r>
-    </w:p>
-    <w:p>
-      <w:r>
-        <w:t>周然：想要就挑，今天我请你。</w:t>
-      </w:r>
-    </w:p>
-    <w:p>
-      <w:r>
-        <w:t>小女孩：我婆婆说，乱花钱会挨骂。</w:t>
-      </w:r>
-    </w:p>
-    <w:p>
-      <w:r>
-        <w:t>周然（笑）：那就算我欠你的。</w:t>
-      </w:r>
-    </w:p>
-    <w:p>
-      <w:r>
-        <w:t>小女孩：你这人怪怪的，咋连我爱吃山楂片都知道？</w:t>
-      </w:r>
-    </w:p>
-    <w:p/>
-    <w:p>
-      <w:pPr>
-        <w:pStyle w:val="Heading2"/>
-      </w:pPr>
-      <w:r>
-        <w:t>1-4 日 外 旧药铺门口</w:t>
-      </w:r>
-    </w:p>
-    <w:p>
-      <w:r>
-        <w:t>△ 路过药铺时，周然脚步突然停住。</w:t>
-      </w:r>
-    </w:p>
-    <w:p>
-      <w:r>
-        <w:t>△ 他看见外婆正扶着墙歇气，手里攥着省出来没舍得买的止疼药单。</w:t>
-      </w:r>
-    </w:p>
-    <w:p>
-      <w:r>
-        <w:t>△ 那张单子像一根针，猛地扎穿周然这些年自以为平静的生活。</w:t>
-      </w:r>
-    </w:p>
-    <w:p>
-      <w:r>
-        <w:t>外婆：小周？你咋在这儿？</w:t>
-      </w:r>
-    </w:p>
-    <w:p>
-      <w:r>
-        <w:t>周然（红了眼）：路过。</w:t>
-      </w:r>
-    </w:p>
-    <w:p>
-      <w:r>
-        <w:t>外婆：你这孩子，怎么一见我就像要哭。</w:t>
-      </w:r>
-    </w:p>
-    <w:p>
-      <w:r>
-        <w:t>周然：风大，迷眼了。</w:t>
-      </w:r>
-    </w:p>
-    <w:p/>
-    <w:p>
-      <w:pPr>
-        <w:pStyle w:val="Heading2"/>
-      </w:pPr>
-      <w:r>
-        <w:t>1-5 日 内 药铺</w:t>
-      </w:r>
-    </w:p>
-    <w:p>
-      <w:r>
-        <w:t>△ 周然抢先把药单递给老板，又多拿了一盒止疼贴和一瓶钙片。</w:t>
-      </w:r>
-    </w:p>
-    <w:p>
-      <w:r>
-        <w:t>△ 外婆伸手拦他，动作急，语气却还是心疼钱。</w:t>
-      </w:r>
-    </w:p>
-    <w:p>
-      <w:r>
-        <w:t>△ 周然把钱塞过去时，手指都在发抖。</w:t>
-      </w:r>
-    </w:p>
-    <w:p>
-      <w:r>
-        <w:t>外婆：买那多干啥？我熬一熬就过去了。</w:t>
-      </w:r>
-    </w:p>
-    <w:p>
-      <w:r>
-        <w:t>周然：疼就不是小事。</w:t>
-      </w:r>
-    </w:p>
-    <w:p>
-      <w:r>
-        <w:t>外婆：你哪来的钱？</w:t>
-      </w:r>
-    </w:p>
-    <w:p>
-      <w:r>
-        <w:t>周然：长大以后攒的。</w:t>
-      </w:r>
-    </w:p>
-    <w:p>
-      <w:r>
-        <w:t>外婆（笑骂）：净说胡话。</w:t>
-      </w:r>
-    </w:p>
-    <w:p/>
-    <w:p>
-      <w:pPr>
-        <w:pStyle w:val="Heading2"/>
-      </w:pPr>
-      <w:r>
-        <w:t>1-6 日 内 老屋灶间</w:t>
-      </w:r>
-    </w:p>
-    <w:p>
-      <w:r>
-        <w:t>△ 傍晚，外婆在灶台前炒菜，油烟升起，屋里全是熟悉的香味。</w:t>
-      </w:r>
-    </w:p>
-    <w:p>
-      <w:r>
-        <w:t>△ 周然站在一旁抢着添柴、端盘子，动作笨拙得像第一次学会做孙子。</w:t>
-      </w:r>
-    </w:p>
-    <w:p>
-      <w:r>
-        <w:t>△ 饭桌上不过三道家常菜，却比他后来吃过的任何山珍海味都要重。</w:t>
-      </w:r>
-    </w:p>
-    <w:p>
-      <w:r>
-        <w:t>外婆：你今天咋这么勤快？</w:t>
-      </w:r>
-    </w:p>
-    <w:p>
-      <w:r>
-        <w:t>周然：以前欠的。</w:t>
-      </w:r>
-    </w:p>
-    <w:p>
-      <w:r>
-        <w:t>外婆：一家人哪有欠不欠的。</w:t>
-      </w:r>
-    </w:p>
-    <w:p>
-      <w:r>
-        <w:t>周然（鼻子发酸）：可我有。</w:t>
-      </w:r>
-    </w:p>
-    <w:p/>
-    <w:p>
-      <w:pPr>
-        <w:pStyle w:val="Heading2"/>
-      </w:pPr>
-      <w:r>
-        <w:t>1-7 日 内 饭桌前</w:t>
-      </w:r>
-    </w:p>
-    <w:p>
-      <w:r>
-        <w:t>△ 周然吃着菜，眼泪却怎么都压不住。</w:t>
-      </w:r>
-    </w:p>
-    <w:p>
-      <w:r>
-        <w:t>△ 他把提前写好的复查时间、药量和一叠钱悄悄塞进外婆围裙口袋。</w:t>
-      </w:r>
-    </w:p>
-    <w:p>
-      <w:r>
-        <w:t>△ 外婆发现后没有立刻拆穿，只是看了他很久。</w:t>
-      </w:r>
-    </w:p>
-    <w:p>
-      <w:r>
-        <w:t>周然：以后头疼了别忍，记得去镇上复查。</w:t>
-      </w:r>
-    </w:p>
-    <w:p>
-      <w:r>
-        <w:t>外婆：你怎么像啥都知道。</w:t>
-      </w:r>
-    </w:p>
-    <w:p>
-      <w:r>
-        <w:t>周然：因为我后悔过。</w:t>
-      </w:r>
-    </w:p>
-    <w:p>
-      <w:r>
-        <w:t>外婆（轻声）：傻孩子，人这一辈子，哪能啥都赶上。</w:t>
-      </w:r>
-    </w:p>
-    <w:p/>
-    <w:p>
-      <w:pPr>
-        <w:pStyle w:val="Heading2"/>
-      </w:pPr>
-      <w:r>
-        <w:t>1-8 夜 内 老屋门口</w:t>
-      </w:r>
-    </w:p>
-    <w:p>
-      <w:r>
-        <w:t>△ 夜里风起，院门轻轻晃动。周然知道时间快到了。</w:t>
-      </w:r>
-    </w:p>
-    <w:p>
-      <w:r>
-        <w:t>△ 他转身抱住外婆，像是怕一松手，人就会再次从这个世界上消失。</w:t>
-      </w:r>
-    </w:p>
-    <w:p>
-      <w:r>
-        <w:t>△ 外婆先是一愣，随后轻轻拍他的背，像小时候哄他睡觉那样。</w:t>
-      </w:r>
-    </w:p>
-    <w:p>
-      <w:r>
-        <w:t>周然：外婆，你别走太早，好不好？</w:t>
-      </w:r>
-    </w:p>
-    <w:p>
-      <w:r>
-        <w:t>外婆：人都会走。</w:t>
-      </w:r>
-    </w:p>
-    <w:p>
-      <w:r>
-        <w:t>周然：那你等等我，至少等等我学会怎么爱你。</w:t>
-      </w:r>
-    </w:p>
-    <w:p>
-      <w:r>
-        <w:t>外婆：你记住，想我了，就回来看看这棵槐树。</w:t>
-      </w:r>
-    </w:p>
-    <w:p/>
-    <w:p>
-      <w:pPr>
-        <w:pStyle w:val="Heading2"/>
-      </w:pPr>
-      <w:r>
-        <w:t>1-9 清晨 内 老屋杂物间</w:t>
-      </w:r>
-    </w:p>
-    <w:p>
-      <w:r>
-        <w:t>△ 周然从杂物间地板上惊醒，天已经亮了，手里还死死攥着那张旧照片。</w:t>
-      </w:r>
-    </w:p>
-    <w:p>
-      <w:r>
-        <w:t>△ 他愣了几秒，猛地翻开照片背面，发现多了一行昨天没有的字。</w:t>
-      </w:r>
-    </w:p>
-    <w:p>
-      <w:r>
-        <w:t>△ 字迹歪歪扭扭，却一眼就是外婆的手：别总觉得来不及。想爱，就早点说。</w:t>
-      </w:r>
-    </w:p>
-    <w:p>
-      <w:r>
-        <w:t>周然（含着泪笑）：这次……我听见了。</w:t>
-      </w:r>
-    </w:p>
-    <w:p/>
-    <w:p>
-      <w:pPr>
-        <w:pStyle w:val="Heading1"/>
-      </w:pPr>
-      <w:r>
-        <w:t>【角色分析】</w:t>
-      </w:r>
-    </w:p>
-    <w:p>
-      <w:pPr>
-        <w:pStyle w:val="ListBullet"/>
-      </w:pPr>
-      <w:r>
-        <w:t>• 周然：成年后的缺席者，也是这次补偿之旅的主动推动者。他的所有行动都来自“已经失去过一次”的后知后觉。</w:t>
-      </w:r>
-    </w:p>
-    <w:p>
-      <w:pPr>
-        <w:pStyle w:val="ListBullet"/>
-      </w:pPr>
-      <w:r>
-        <w:t>• 外婆：不是单纯被怀念的对象，而是用最日常的爱稳住整个故事的人。她不讲大道理，但她的每句推辞、每次夹菜，都是周然最舍不得失去的部分。</w:t>
-      </w:r>
-    </w:p>
-    <w:p>
-      <w:pPr>
-        <w:pStyle w:val="ListBullet"/>
-      </w:pPr>
-      <w:r>
-        <w:t>• 小女孩（念念）：既是时空入口，也是“旧日生活仍在照常发生”的见证，让观众更快进入那个已经回不去的世界。</w:t>
-      </w:r>
-    </w:p>
-    <w:p>
-      <w:pPr>
-        <w:pStyle w:val="Heading1"/>
-      </w:pPr>
-      <w:r>
-        <w:t>【教育意义/文化价值】</w:t>
-      </w:r>
-    </w:p>
-    <w:p>
-      <w:pPr>
-        <w:pStyle w:val="ListBullet"/>
-      </w:pPr>
-      <w:r>
-        <w:t>• 把“遗憾亲情”拍成可感知的现实动作，而不是空喊思念。</w:t>
-      </w:r>
-    </w:p>
-    <w:p>
-      <w:pPr>
-        <w:pStyle w:val="ListBullet"/>
-      </w:pPr>
-      <w:r>
-        <w:t>• 提醒观众：真正的亏欠常常不是没赚到多少钱，而是没在还来得及的时候多陪一顿饭、多说一句关心。</w:t>
-      </w:r>
-    </w:p>
-    <w:p>
-      <w:pPr>
-        <w:pStyle w:val="ListBullet"/>
-      </w:pPr>
-      <w:r>
-        <w:t>• 通过旧屋、集市、药铺、灶台这些生活化场景，把中国家庭里最普遍的情感后悔具体化。</w:t>
-      </w:r>
-    </w:p>
-    <w:p>
-      <w:pPr>
-        <w:pStyle w:val="Heading1"/>
-      </w:pPr>
-      <w:r>
-        <w:t>【核心爆点】</w:t>
-      </w:r>
-    </w:p>
-    <w:p>
-      <w:pPr>
-        <w:pStyle w:val="ListBullet"/>
-      </w:pPr>
-      <w:r>
-        <w:t>• 时空穿越只是外壳，真正抓人的是“迟到的补偿”。</w:t>
-      </w:r>
-    </w:p>
-    <w:p>
-      <w:pPr>
-        <w:pStyle w:val="ListBullet"/>
-      </w:pPr>
-      <w:r>
-        <w:t>• 把买药、塞钱、提醒复查这些成年人的关心，放进童年记忆场景里，天然有反差和杀伤力。</w:t>
-      </w:r>
-    </w:p>
-    <w:p>
-      <w:pPr>
-        <w:pStyle w:val="ListBullet"/>
-      </w:pPr>
-      <w:r>
-        <w:t>• 结尾不靠嚎哭，而靠一句“别总觉得来不及”，把观众自己的遗憾一并勾出来。</w:t>
-      </w:r>
-    </w:p>
-    <w:p>
-      <w:pPr>
-        <w:pStyle w:val="Heading1"/>
-      </w:pPr>
-      <w:r>
-        <w:t>【可替换部分】</w:t>
-      </w:r>
-    </w:p>
-    <w:p>
-      <w:pPr>
-        <w:pStyle w:val="ListBullet"/>
-      </w:pPr>
-      <w:r>
-        <w:t>• 亲人对象：外婆可替换成奶奶、爷爷、外公、父亲、母亲、启蒙老师。</w:t>
-      </w:r>
-    </w:p>
-    <w:p>
-      <w:pPr>
-        <w:pStyle w:val="ListBullet"/>
-      </w:pPr>
-      <w:r>
-        <w:t>• 补偿事项：买药、复查、赶集、做饭，可替换成陪看病、修旧房、照相、送衣服、过生日。</w:t>
-      </w:r>
-    </w:p>
-    <w:p>
-      <w:pPr>
-        <w:pStyle w:val="ListBullet"/>
-      </w:pPr>
-      <w:r>
-        <w:t>• 时空入口：照片可替换成旧录音、老电话、旧课本、旧围裙、旧车票。</w:t>
-      </w:r>
-    </w:p>
-    <w:p>
-      <w:pPr>
-        <w:pStyle w:val="ListBullet"/>
-      </w:pPr>
-      <w:r>
-        <w:t>• 情绪落点：原版是“我终于听见了”，也可落到“这次换我记住你说的话”。</w:t>
-      </w:r>
-    </w:p>
-    <w:p>
-      <w:pPr>
-        <w:pStyle w:val="Heading1"/>
-      </w:pPr>
-      <w:r>
-        <w:t>【技术参数】</w:t>
-      </w:r>
-    </w:p>
-    <w:p>
-      <w:r>
-        <w:t>时长：3分钟左右</w:t>
-      </w:r>
-    </w:p>
-    <w:p>
-      <w:r>
-        <w:t>类型：亲情治愈 / 现实幻想短剧</w:t>
-      </w:r>
-    </w:p>
-    <w:p>
-      <w:r>
-        <w:t>核心机制：迟到的补偿 + 日常细节反杀 + 结尾温柔明牌</w:t>
-      </w:r>
-    </w:p>
-    <w:p>
-      <w:r>
-        <w:t>主要场景：老屋杂物间 / 乡间土路 / 集市 / 药铺 / 灶间 / 饭桌 / 院门口</w:t>
-      </w:r>
-    </w:p>
-    <w:p>
-      <w:r>
-        <w:t>改编关键词：回到过去、再见亲人、补偿遗憾、家常饭、体检、旧照片</w:t>
-      </w:r>
-    </w:p>
-    <w:p/>
-    <w:p>
-      <w:r>
-        <w:t>生成时间：2026-06-16 21:37:51</w:t>
-      </w:r>
-    </w:p>
-    <w:p>
-      <w:r>
-        <w:t>生成方式：基于 v3 分析结果的改编版短剧脚本</w:t>
+        <w:t>生成时间：2026-06-16</w:t>
+      </w:r>
+      <w:r>
+        <w:br/>
+      </w:r>
+      <w:r>
+        <w:t>生成方式：扩写增强版改编脚本</w:t>
       </w:r>
     </w:p>
     <w:sectPr>
@@ -961,8 +1229,8 @@
     <w:qFormat/>
     <w:rsid w:val="00FC693F"/>
     <w:rPr>
-      <w:rFonts w:ascii="Microsoft YaHei" w:hAnsi="Microsoft YaHei"/>
-      <w:sz w:val="24"/>
+      <w:rFonts w:ascii="PingFang SC" w:hAnsi="PingFang SC"/>
+      <w:sz w:val="22"/>
     </w:rPr>
   </w:style>
   <w:style w:type="paragraph" w:styleId="Header">

</xml_diff>

<commit_message>
Trim opening scene from Muyan adapted script
</commit_message>
<xml_diff>
--- a/deliverables/暮言/改编脚本.docx
+++ b/deliverables/暮言/改编脚本.docx
@@ -33,827 +33,784 @@
     </w:p>
     <w:p>
       <w:r>
-        <w:t>1-1 夜 内 老屋杂物间</w:t>
+        <w:t>1-1 日 外 乡间土路</w:t>
       </w:r>
       <w:r>
         <w:br/>
       </w:r>
       <w:r>
-        <w:t>△ 周然一个人蹲在堆满旧箱子的杂物间里，灰尘被手电筒光柱打得四处漂浮。</w:t>
+        <w:t>△ 刺眼天光晃过，周然猛地从土路边坐起，耳边是蝉鸣、自行车铃和有人吆喝卖冰棍的声音。</w:t>
       </w:r>
       <w:r>
         <w:br/>
       </w:r>
       <w:r>
-        <w:t>△ 他翻出一只掉漆铁盒，里面压着旧车票、粮票、外婆的针线包，最底下是一张泛黄照片。</w:t>
+        <w:t>△ 一个扎羊角辫的小女孩蹲在旁边，手里攥着一根狗尾巴草，警惕又好奇地盯着他。</w:t>
       </w:r>
       <w:r>
         <w:br/>
       </w:r>
       <w:r>
-        <w:t>△ 照片里，外婆穿着旧碎花衫，牵着七岁的他站在集市口，背后是卖糖画和风扇帽的小摊。</w:t>
+        <w:t>△ 周然抬头，看见还没被拆掉的老砖房和那棵老槐树，整个人一下僵住。</w:t>
       </w:r>
       <w:r>
         <w:br/>
       </w:r>
       <w:r>
-        <w:t>周然（低声）：你怎么还留着这张……</w:t>
+        <w:t>小女孩：你咋躺这儿啊？是不是中暑了？</w:t>
       </w:r>
       <w:r>
         <w:br/>
       </w:r>
       <w:r>
-        <w:t>周然（坐在地上，笑了一下又红眼）：外婆，我都快忘了你那天穿啥颜色衣服了。</w:t>
+        <w:t>周然（怔住）：念念？</w:t>
       </w:r>
       <w:r>
         <w:br/>
       </w:r>
       <w:r>
-        <w:t>周然：要是能再见你一次就好了，哪怕就一天。</w:t>
+        <w:t>小女孩：你认识我？</w:t>
       </w:r>
       <w:r>
         <w:br/>
       </w:r>
       <w:r>
-        <w:t>△ 风从窗缝灌进来，照片背面一角像被人摸过，起了边。</w:t>
+        <w:t>周然（喃喃）：这不是……十五年前吗？</w:t>
+      </w:r>
+      <w:r>
+        <w:br/>
+      </w:r>
+      <w:r>
+        <w:t>小女孩：你说啥呢？你要不要喝水？</w:t>
+      </w:r>
+      <w:r>
+        <w:br/>
+      </w:r>
+      <w:r>
+        <w:t>周然（接过水，眼眶发热）：要。</w:t>
       </w:r>
     </w:p>
     <w:p>
       <w:r>
-        <w:t>1-2 日 外 乡间土路</w:t>
+        <w:t>1-2 日 外 去集市的路上</w:t>
       </w:r>
       <w:r>
         <w:br/>
       </w:r>
       <w:r>
-        <w:t>△ 刺眼天光晃过，周然猛地从土路边坐起，耳边是蝉鸣、自行车铃和有人吆喝卖冰棍的声音。</w:t>
+        <w:t>△ 念念提着竹篮往前走，周然像怕一眨眼就会醒，紧紧跟着她。</w:t>
       </w:r>
       <w:r>
         <w:br/>
       </w:r>
       <w:r>
-        <w:t>△ 一个扎羊角辫的小女孩蹲在旁边，手里攥着一根狗尾巴草，警惕又好奇地盯着他。</w:t>
+        <w:t>△ 她一路碎碎念，说外婆今天要去赶集、要买盐、要买灯芯，还说自己想买糖片但不敢开口。</w:t>
       </w:r>
       <w:r>
         <w:br/>
       </w:r>
       <w:r>
-        <w:t>△ 周然抬头，看见还没被拆掉的老砖房和那棵老槐树，整个人一下僵住。</w:t>
+        <w:t>△ 周然一边听，一边把每个细节和记忆对上，像重新走进自己早就失去的童年。</w:t>
       </w:r>
       <w:r>
         <w:br/>
       </w:r>
       <w:r>
-        <w:t>小女孩：你咋躺这儿啊？是不是中暑了？</w:t>
+        <w:t>念念：你别老盯着我看，怪吓人的。</w:t>
       </w:r>
       <w:r>
         <w:br/>
       </w:r>
       <w:r>
-        <w:t>周然（怔住）：念念？</w:t>
+        <w:t>周然（笑）：我是在想，你小时候比我记得的还瘦。</w:t>
       </w:r>
       <w:r>
         <w:br/>
       </w:r>
       <w:r>
-        <w:t>小女孩：你认识我？</w:t>
+        <w:t>念念：你怎么老说我小时候？</w:t>
       </w:r>
       <w:r>
         <w:br/>
       </w:r>
       <w:r>
-        <w:t>周然（喃喃）：这不是……十五年前吗？</w:t>
+        <w:t>周然：因为我认识长大后的你。</w:t>
       </w:r>
       <w:r>
         <w:br/>
       </w:r>
       <w:r>
-        <w:t>小女孩：你说啥呢？你要不要喝水？</w:t>
+        <w:t>念念：你这人说话神神叨叨的。</w:t>
       </w:r>
       <w:r>
         <w:br/>
       </w:r>
       <w:r>
-        <w:t>周然（接过水，眼眶发热）：要。</w:t>
+        <w:t>周然：那你今天是不是想买山楂片？</w:t>
+      </w:r>
+      <w:r>
+        <w:br/>
+      </w:r>
+      <w:r>
+        <w:t>念念（愣住）：你咋知道？</w:t>
+      </w:r>
+      <w:r>
+        <w:br/>
+      </w:r>
+      <w:r>
+        <w:t>周然：还想要那个小风扇帽，和玻璃弹珠。</w:t>
+      </w:r>
+      <w:r>
+        <w:br/>
+      </w:r>
+      <w:r>
+        <w:t>念念：你偷听我说话了？</w:t>
+      </w:r>
+      <w:r>
+        <w:br/>
+      </w:r>
+      <w:r>
+        <w:t>周然：没有，我就是知道。</w:t>
       </w:r>
     </w:p>
     <w:p>
       <w:r>
-        <w:t>1-3 日 外 去集市的路上</w:t>
+        <w:t>1-3 日 外 集市口</w:t>
       </w:r>
       <w:r>
         <w:br/>
       </w:r>
       <w:r>
-        <w:t>△ 念念提着竹篮往前走，周然像怕一眨眼就会醒，紧紧跟着她。</w:t>
+        <w:t>△ 集市热闹，布摊、药铺、肉案、糖画摊全挤在一条街上。</w:t>
       </w:r>
       <w:r>
         <w:br/>
       </w:r>
       <w:r>
-        <w:t>△ 她一路碎碎念，说外婆今天要去赶集、要买盐、要买灯芯，还说自己想买糖片但不敢开口。</w:t>
+        <w:t>△ 念念嘴硬说不买，眼神却一步三回头。周然故作轻松，把她想要的东西一口气全买下来。</w:t>
       </w:r>
       <w:r>
         <w:br/>
       </w:r>
       <w:r>
-        <w:t>△ 周然一边听，一边把每个细节和记忆对上，像重新走进自己早就失去的童年。</w:t>
+        <w:t>△ 这场戏的重点不是宠小孩，而是周然第一次真正感到“我还能补一点”。</w:t>
       </w:r>
       <w:r>
         <w:br/>
       </w:r>
       <w:r>
-        <w:t>念念：你别老盯着我看，怪吓人的。</w:t>
+        <w:t>周然（对摊主）：山楂片来两包，糖块称半斤，那个带小风扇的帽子拿一个。</w:t>
       </w:r>
       <w:r>
         <w:br/>
       </w:r>
       <w:r>
-        <w:t>周然（笑）：我是在想，你小时候比我记得的还瘦。</w:t>
+        <w:t>念念：别买了，我婆婆知道会骂我的。</w:t>
       </w:r>
       <w:r>
         <w:br/>
       </w:r>
       <w:r>
-        <w:t>念念：你怎么老说我小时候？</w:t>
+        <w:t>周然：那就说是我缠着你买的。</w:t>
       </w:r>
       <w:r>
         <w:br/>
       </w:r>
       <w:r>
-        <w:t>周然：因为我认识长大后的你。</w:t>
+        <w:t>念念：你谁啊你？</w:t>
       </w:r>
       <w:r>
         <w:br/>
       </w:r>
       <w:r>
-        <w:t>念念：你这人说话神神叨叨的。</w:t>
+        <w:t>周然：一个欠你们家很多的人。</w:t>
       </w:r>
       <w:r>
         <w:br/>
       </w:r>
       <w:r>
-        <w:t>周然：那你今天是不是想买山楂片？</w:t>
+        <w:t>念念：你真怪。</w:t>
       </w:r>
       <w:r>
         <w:br/>
       </w:r>
       <w:r>
-        <w:t>念念（愣住）：你咋知道？</w:t>
+        <w:t>周然：那你高兴没？</w:t>
       </w:r>
       <w:r>
         <w:br/>
       </w:r>
       <w:r>
-        <w:t>周然：还想要那个小风扇帽，和玻璃弹珠。</w:t>
-      </w:r>
-      <w:r>
-        <w:br/>
-      </w:r>
-      <w:r>
-        <w:t>念念：你偷听我说话了？</w:t>
-      </w:r>
-      <w:r>
-        <w:br/>
-      </w:r>
-      <w:r>
-        <w:t>周然：没有，我就是知道。</w:t>
+        <w:t>念念（压着笑）：……有一点。</w:t>
       </w:r>
     </w:p>
     <w:p>
       <w:r>
-        <w:t>1-4 日 外 集市口</w:t>
+        <w:t>1-4 日 外 旧药铺门口</w:t>
       </w:r>
       <w:r>
         <w:br/>
       </w:r>
       <w:r>
-        <w:t>△ 集市热闹，布摊、药铺、肉案、糖画摊全挤在一条街上。</w:t>
+        <w:t>△ 经过药铺时，周然突然停住。他看见外婆扶着门框，正拿着一张药单犹豫，像在算钱够不够。</w:t>
       </w:r>
       <w:r>
         <w:br/>
       </w:r>
       <w:r>
-        <w:t>△ 念念嘴硬说不买，眼神却一步三回头。周然故作轻松，把她想要的东西一口气全买下来。</w:t>
+        <w:t>△ 她没什么大病样子，只是脸色发白，额角冒汗，像是头疼又犯了。</w:t>
       </w:r>
       <w:r>
         <w:br/>
       </w:r>
       <w:r>
-        <w:t>△ 这场戏的重点不是宠小孩，而是周然第一次真正感到“我还能补一点”。</w:t>
+        <w:t>△ 周然上辈子没看到这一幕，这一世一眼就明白，她当年不是没病，是舍不得花钱。</w:t>
       </w:r>
       <w:r>
         <w:br/>
       </w:r>
       <w:r>
-        <w:t>周然（对摊主）：山楂片来两包，糖块称半斤，那个带小风扇的帽子拿一个。</w:t>
+        <w:t>外婆：小周？你咋在这儿？</w:t>
       </w:r>
       <w:r>
         <w:br/>
       </w:r>
       <w:r>
-        <w:t>念念：别买了，我婆婆知道会骂我的。</w:t>
+        <w:t>周然（眼圈一下红了）：路过。</w:t>
       </w:r>
       <w:r>
         <w:br/>
       </w:r>
       <w:r>
-        <w:t>周然：那就说是我缠着你买的。</w:t>
+        <w:t>外婆：你这孩子，咋一见我就跟受委屈似的。</w:t>
       </w:r>
       <w:r>
         <w:br/>
       </w:r>
       <w:r>
-        <w:t>念念：你谁啊你？</w:t>
+        <w:t>周然：风大，迷眼了。</w:t>
       </w:r>
       <w:r>
         <w:br/>
       </w:r>
       <w:r>
-        <w:t>周然：一个欠你们家很多的人。</w:t>
+        <w:t>外婆：少来，你小时候撒谎就这德行。</w:t>
       </w:r>
       <w:r>
         <w:br/>
       </w:r>
       <w:r>
-        <w:t>念念：你真怪。</w:t>
+        <w:t>周然（怔住）：你还记得？</w:t>
       </w:r>
       <w:r>
         <w:br/>
       </w:r>
       <w:r>
-        <w:t>周然：那你高兴没？</w:t>
-      </w:r>
-      <w:r>
-        <w:br/>
-      </w:r>
-      <w:r>
-        <w:t>念念（压着笑）：……有一点。</w:t>
+        <w:t>外婆：我记不得谁，也记得你。</w:t>
       </w:r>
     </w:p>
     <w:p>
       <w:r>
-        <w:t>1-5 日 外 旧药铺门口</w:t>
+        <w:t>1-5 日 内 药铺</w:t>
       </w:r>
       <w:r>
         <w:br/>
       </w:r>
       <w:r>
-        <w:t>△ 经过药铺时，周然突然停住。他看见外婆扶着门框，正拿着一张药单犹豫，像在算钱够不够。</w:t>
+        <w:t>△ 周然抢过药单，顺手多拿了止疼贴、钙片和一支红花油。</w:t>
       </w:r>
       <w:r>
         <w:br/>
       </w:r>
       <w:r>
-        <w:t>△ 她没什么大病样子，只是脸色发白，额角冒汗，像是头疼又犯了。</w:t>
+        <w:t>△ 外婆一边拦，一边嫌他乱花钱，可眼神里全是那种老人心疼小辈又不舍得真的拒绝的劲儿。</w:t>
       </w:r>
       <w:r>
         <w:br/>
       </w:r>
       <w:r>
-        <w:t>△ 周然上辈子没看到这一幕，这一世一眼就明白，她当年不是没病，是舍不得花钱。</w:t>
+        <w:t>周然：这些也一起装上。</w:t>
       </w:r>
       <w:r>
         <w:br/>
       </w:r>
       <w:r>
-        <w:t>外婆：小周？你咋在这儿？</w:t>
+        <w:t>外婆：买那么多干啥？我熬一熬就过去了。</w:t>
       </w:r>
       <w:r>
         <w:br/>
       </w:r>
       <w:r>
-        <w:t>周然（眼圈一下红了）：路过。</w:t>
+        <w:t>周然：疼就不是小事。</w:t>
       </w:r>
       <w:r>
         <w:br/>
       </w:r>
       <w:r>
-        <w:t>外婆：你这孩子，咋一见我就跟受委屈似的。</w:t>
+        <w:t>外婆：你哪来的钱？</w:t>
       </w:r>
       <w:r>
         <w:br/>
       </w:r>
       <w:r>
-        <w:t>周然：风大，迷眼了。</w:t>
+        <w:t>周然：长大以后攒的。</w:t>
       </w:r>
       <w:r>
         <w:br/>
       </w:r>
       <w:r>
-        <w:t>外婆：少来，你小时候撒谎就这德行。</w:t>
+        <w:t>外婆（笑骂）：又说胡话。</w:t>
       </w:r>
       <w:r>
         <w:br/>
       </w:r>
       <w:r>
-        <w:t>周然（怔住）：你还记得？</w:t>
+        <w:t>周然：我没胡话。以前没人替你买，我现在补上。</w:t>
       </w:r>
       <w:r>
         <w:br/>
       </w:r>
       <w:r>
-        <w:t>外婆：我记不得谁，也记得你。</w:t>
+        <w:t>外婆（没听清）：你说啥？</w:t>
+      </w:r>
+      <w:r>
+        <w:br/>
+      </w:r>
+      <w:r>
+        <w:t>周然（低头笑）：我说，今天我请。</w:t>
       </w:r>
     </w:p>
     <w:p>
       <w:r>
-        <w:t>1-6 日 内 药铺</w:t>
+        <w:t>1-6 傍晚 内 老屋灶间</w:t>
       </w:r>
       <w:r>
         <w:br/>
       </w:r>
       <w:r>
-        <w:t>△ 周然抢过药单，顺手多拿了止疼贴、钙片和一支红花油。</w:t>
+        <w:t>△ 回到家，外婆系上围裙准备做饭。周然像怕时间跑掉似的，一直围着灶台转，抢着淘米、添柴、端菜。</w:t>
       </w:r>
       <w:r>
         <w:br/>
       </w:r>
       <w:r>
-        <w:t>△ 外婆一边拦，一边嫌他乱花钱，可眼神里全是那种老人心疼小辈又不舍得真的拒绝的劲儿。</w:t>
+        <w:t>△ 念念坐在门槛上吃山楂片，看他们俩忙成一团，屋子里全是锅铲声和油烟气。</w:t>
       </w:r>
       <w:r>
         <w:br/>
       </w:r>
       <w:r>
-        <w:t>周然：这些也一起装上。</w:t>
+        <w:t>外婆：你今天咋这么勤快？</w:t>
       </w:r>
       <w:r>
         <w:br/>
       </w:r>
       <w:r>
-        <w:t>外婆：买那么多干啥？我熬一熬就过去了。</w:t>
+        <w:t>周然：以前没来得及勤快。</w:t>
       </w:r>
       <w:r>
         <w:br/>
       </w:r>
       <w:r>
-        <w:t>周然：疼就不是小事。</w:t>
+        <w:t>外婆：你才多大，讲得跟活过两辈子似的。</w:t>
       </w:r>
       <w:r>
         <w:br/>
       </w:r>
       <w:r>
-        <w:t>外婆：你哪来的钱？</w:t>
+        <w:t>念念：我就说他怪吧。</w:t>
       </w:r>
       <w:r>
         <w:br/>
       </w:r>
       <w:r>
-        <w:t>周然：长大以后攒的。</w:t>
+        <w:t>周然（笑）：我怪，你们收留一下。</w:t>
       </w:r>
       <w:r>
         <w:br/>
       </w:r>
       <w:r>
-        <w:t>外婆（笑骂）：又说胡话。</w:t>
+        <w:t>外婆：行，怪人也得先把柴火抱进来。</w:t>
       </w:r>
       <w:r>
         <w:br/>
       </w:r>
       <w:r>
-        <w:t>周然：我没胡话。以前没人替你买，我现在补上。</w:t>
-      </w:r>
-      <w:r>
-        <w:br/>
-      </w:r>
-      <w:r>
-        <w:t>外婆（没听清）：你说啥？</w:t>
-      </w:r>
-      <w:r>
-        <w:br/>
-      </w:r>
-      <w:r>
-        <w:t>周然（低头笑）：我说，今天我请。</w:t>
+        <w:t>△ 三个人的气氛开始像真正的一家人，而不是谁突然闯进来借住的一天。</w:t>
       </w:r>
     </w:p>
     <w:p>
       <w:r>
-        <w:t>1-7 傍晚 内 老屋灶间</w:t>
+        <w:t>1-7 夜 内 饭桌前</w:t>
       </w:r>
       <w:r>
         <w:br/>
       </w:r>
       <w:r>
-        <w:t>△ 回到家，外婆系上围裙准备做饭。周然像怕时间跑掉似的，一直围着灶台转，抢着淘米、添柴、端菜。</w:t>
+        <w:t>△ 菜端上桌，不过是蒜苗炒肉、清炒南瓜、咸菜和一碗蛋花汤，可周然吃第一口就红了眼。</w:t>
       </w:r>
       <w:r>
         <w:br/>
       </w:r>
       <w:r>
-        <w:t>△ 念念坐在门槛上吃山楂片，看他们俩忙成一团，屋子里全是锅铲声和油烟气。</w:t>
+        <w:t>△ 外婆先是装作没看见，后来还是忍不住开口问他是不是饭菜不合口。</w:t>
       </w:r>
       <w:r>
         <w:br/>
       </w:r>
       <w:r>
-        <w:t>外婆：你今天咋这么勤快？</w:t>
+        <w:t>外婆：愣着干啥，吃啊。</w:t>
       </w:r>
       <w:r>
         <w:br/>
       </w:r>
       <w:r>
-        <w:t>周然：以前没来得及勤快。</w:t>
+        <w:t>周然：你炒的蒜苗肉还是这个味儿。</w:t>
       </w:r>
       <w:r>
         <w:br/>
       </w:r>
       <w:r>
-        <w:t>外婆：你才多大，讲得跟活过两辈子似的。</w:t>
+        <w:t>外婆：什么叫“还是”？我一直就这味儿。</w:t>
       </w:r>
       <w:r>
         <w:br/>
       </w:r>
       <w:r>
-        <w:t>念念：我就说他怪吧。</w:t>
+        <w:t>念念：他说话老像认识咱很久了。</w:t>
       </w:r>
       <w:r>
         <w:br/>
       </w:r>
       <w:r>
-        <w:t>周然（笑）：我怪，你们收留一下。</w:t>
+        <w:t>周然（低头吃了一口）：太久了。</w:t>
       </w:r>
       <w:r>
         <w:br/>
       </w:r>
       <w:r>
-        <w:t>外婆：行，怪人也得先把柴火抱进来。</w:t>
+        <w:t>外婆：菜不好吃？</w:t>
       </w:r>
       <w:r>
         <w:br/>
       </w:r>
       <w:r>
-        <w:t>△ 三个人的气氛开始像真正的一家人，而不是谁突然闯进来借住的一天。</w:t>
+        <w:t>周然（喉咙发紧）：好吃。就是……吃着像回家了。</w:t>
+      </w:r>
+      <w:r>
+        <w:br/>
+      </w:r>
+      <w:r>
+        <w:t>外婆：那你以后常来，我给你做。</w:t>
+      </w:r>
+      <w:r>
+        <w:br/>
+      </w:r>
+      <w:r>
+        <w:t>周然：嗯，我一定常来。</w:t>
+      </w:r>
+      <w:r>
+        <w:br/>
+      </w:r>
+      <w:r>
+        <w:t>△ 他说“常来”的时候自己都知道，这是最晚的一句承诺。</w:t>
       </w:r>
     </w:p>
     <w:p>
       <w:r>
-        <w:t>1-8 夜 内 饭桌前</w:t>
+        <w:t>1-8 夜 内 迟到的叮嘱</w:t>
       </w:r>
       <w:r>
         <w:br/>
       </w:r>
       <w:r>
-        <w:t>△ 菜端上桌，不过是蒜苗炒肉、清炒南瓜、咸菜和一碗蛋花汤，可周然吃第一口就红了眼。</w:t>
+        <w:t>△ 饭后，念念去院里玩，外婆收拾碗筷。周然趁她不注意，把准备好的纸条和钱塞进她围裙口袋。</w:t>
       </w:r>
       <w:r>
         <w:br/>
       </w:r>
       <w:r>
-        <w:t>△ 外婆先是装作没看见，后来还是忍不住开口问他是不是饭菜不合口。</w:t>
+        <w:t>△ 纸条上写着复查时间、药量和一句“头疼别忍”。</w:t>
       </w:r>
       <w:r>
         <w:br/>
       </w:r>
       <w:r>
-        <w:t>外婆：愣着干啥，吃啊。</w:t>
+        <w:t>外婆发现了，没有立刻揭穿，只把围裙按住，抬头看了他很久。</w:t>
       </w:r>
       <w:r>
         <w:br/>
       </w:r>
       <w:r>
-        <w:t>周然：你炒的蒜苗肉还是这个味儿。</w:t>
+        <w:t>周然：以后头疼了别扛，记得去镇上复查。</w:t>
       </w:r>
       <w:r>
         <w:br/>
       </w:r>
       <w:r>
-        <w:t>外婆：什么叫“还是”？我一直就这味儿。</w:t>
+        <w:t>外婆：你怎么啥都知道？</w:t>
       </w:r>
       <w:r>
         <w:br/>
       </w:r>
       <w:r>
-        <w:t>念念：他说话老像认识咱很久了。</w:t>
+        <w:t>周然：因为我后悔过。</w:t>
       </w:r>
       <w:r>
         <w:br/>
       </w:r>
       <w:r>
-        <w:t>周然（低头吃了一口）：太久了。</w:t>
+        <w:t>外婆：人这一辈子，哪能样样都赶上。</w:t>
       </w:r>
       <w:r>
         <w:br/>
       </w:r>
       <w:r>
-        <w:t>外婆：菜不好吃？</w:t>
+        <w:t>周然：可我总觉得，我欠你的太多了。</w:t>
       </w:r>
       <w:r>
         <w:br/>
       </w:r>
       <w:r>
-        <w:t>周然（喉咙发紧）：好吃。就是……吃着像回家了。</w:t>
+        <w:t>外婆（轻轻笑）：一家人哪有欠不欠的。</w:t>
       </w:r>
       <w:r>
         <w:br/>
       </w:r>
       <w:r>
-        <w:t>外婆：那你以后常来，我给你做。</w:t>
+        <w:t>周然：有的。有些话没说，有些路没陪，有些病没早点带你去看，这些都算。</w:t>
       </w:r>
       <w:r>
         <w:br/>
       </w:r>
       <w:r>
-        <w:t>周然：嗯，我一定常来。</w:t>
+        <w:t>外婆（沉默片刻）：那你今天不是回来了吗？</w:t>
       </w:r>
       <w:r>
         <w:br/>
       </w:r>
       <w:r>
-        <w:t>△ 他说“常来”的时候自己都知道，这是最晚的一句承诺。</w:t>
+        <w:t>△ 这句话像是原谅，也像是在提醒他，爱不是只能在失去后才开始算账。</w:t>
       </w:r>
     </w:p>
     <w:p>
       <w:r>
-        <w:t>1-9 夜 内 迟到的叮嘱</w:t>
+        <w:t>1-9 夜 外 院门口</w:t>
       </w:r>
       <w:r>
         <w:br/>
       </w:r>
       <w:r>
-        <w:t>△ 饭后，念念去院里玩，外婆收拾碗筷。周然趁她不注意，把准备好的纸条和钱塞进她围裙口袋。</w:t>
+        <w:t>△ 夜深了，老槐树叶子被风吹得簌簌响。周然忽然开始不安，他知道这一天快结束了。</w:t>
       </w:r>
       <w:r>
         <w:br/>
       </w:r>
       <w:r>
-        <w:t>△ 纸条上写着复查时间、药量和一句“头疼别忍”。</w:t>
+        <w:t>△ 他站在院门口看着外婆给念念掖被角，像看见自己生命里最温暖、也最无力挽留的一块地方。</w:t>
       </w:r>
       <w:r>
         <w:br/>
       </w:r>
       <w:r>
-        <w:t>外婆发现了，没有立刻揭穿，只把围裙按住，抬头看了他很久。</w:t>
+        <w:t>周然：外婆。</w:t>
       </w:r>
       <w:r>
         <w:br/>
       </w:r>
       <w:r>
-        <w:t>周然：以后头疼了别扛，记得去镇上复查。</w:t>
+        <w:t>外婆：嗯？</w:t>
       </w:r>
       <w:r>
         <w:br/>
       </w:r>
       <w:r>
-        <w:t>外婆：你怎么啥都知道？</w:t>
+        <w:t>周然：你别走太早，好不好？</w:t>
       </w:r>
       <w:r>
         <w:br/>
       </w:r>
       <w:r>
-        <w:t>周然：因为我后悔过。</w:t>
+        <w:t>外婆（愣了愣）：人哪有不走的。</w:t>
       </w:r>
       <w:r>
         <w:br/>
       </w:r>
       <w:r>
-        <w:t>外婆：人这一辈子，哪能样样都赶上。</w:t>
+        <w:t>周然：那你等等我，至少等等我学会怎么好好爱你。</w:t>
       </w:r>
       <w:r>
         <w:br/>
       </w:r>
       <w:r>
-        <w:t>周然：可我总觉得，我欠你的太多了。</w:t>
+        <w:t>外婆：傻孩子，想我了，就回来看看这棵槐树。</w:t>
       </w:r>
       <w:r>
         <w:br/>
       </w:r>
       <w:r>
-        <w:t>外婆（轻轻笑）：一家人哪有欠不欠的。</w:t>
+        <w:t>周然（突然抱住她）：我怕我以后再也抱不着了。</w:t>
       </w:r>
       <w:r>
         <w:br/>
       </w:r>
       <w:r>
-        <w:t>周然：有的。有些话没说，有些路没陪，有些病没早点带你去看，这些都算。</w:t>
+        <w:t>外婆先是一怔，随后慢慢抬手拍他的背。</w:t>
       </w:r>
       <w:r>
         <w:br/>
       </w:r>
       <w:r>
-        <w:t>外婆（沉默片刻）：那你今天不是回来了吗？</w:t>
-      </w:r>
-      <w:r>
-        <w:br/>
-      </w:r>
-      <w:r>
-        <w:t>△ 这句话像是原谅，也像是在提醒他，爱不是只能在失去后才开始算账。</w:t>
+        <w:t>外婆：抱得着。你记着，我疼过你，这就够你走很远了。</w:t>
       </w:r>
     </w:p>
     <w:p>
       <w:r>
-        <w:t>1-10 夜 外 院门口</w:t>
+        <w:t>1-10 清晨 内 老屋杂物间</w:t>
       </w:r>
       <w:r>
         <w:br/>
       </w:r>
       <w:r>
-        <w:t>△ 夜深了，老槐树叶子被风吹得簌簌响。周然忽然开始不安，他知道这一天快结束了。</w:t>
+        <w:t>△ 天光微亮，周然猛地从杂物间惊醒，手里还死死攥着那张旧照片。</w:t>
       </w:r>
       <w:r>
         <w:br/>
       </w:r>
       <w:r>
-        <w:t>△ 他站在院门口看着外婆给念念掖被角，像看见自己生命里最温暖、也最无力挽留的一块地方。</w:t>
+        <w:t>△ 他喘着气翻过照片，发现背面多了一行昨天没有的字，字迹歪斜，却分明是外婆的手。</w:t>
       </w:r>
       <w:r>
         <w:br/>
       </w:r>
       <w:r>
-        <w:t>周然：外婆。</w:t>
+        <w:t>△ 上面写着：别总觉得来不及。想爱，就早点说。</w:t>
       </w:r>
       <w:r>
         <w:br/>
       </w:r>
       <w:r>
-        <w:t>外婆：嗯？</w:t>
+        <w:t>周然盯着那行字，眼泪一下掉下来，终于不是崩溃，而像真的被听见了。</w:t>
       </w:r>
       <w:r>
         <w:br/>
       </w:r>
       <w:r>
-        <w:t>周然：你别走太早，好不好？</w:t>
-      </w:r>
-      <w:r>
-        <w:br/>
-      </w:r>
-      <w:r>
-        <w:t>外婆（愣了愣）：人哪有不走的。</w:t>
-      </w:r>
-      <w:r>
-        <w:br/>
-      </w:r>
-      <w:r>
-        <w:t>周然：那你等等我，至少等等我学会怎么好好爱你。</w:t>
-      </w:r>
-      <w:r>
-        <w:br/>
-      </w:r>
-      <w:r>
-        <w:t>外婆：傻孩子，想我了，就回来看看这棵槐树。</w:t>
-      </w:r>
-      <w:r>
-        <w:br/>
-      </w:r>
-      <w:r>
-        <w:t>周然（突然抱住她）：我怕我以后再也抱不着了。</w:t>
-      </w:r>
-      <w:r>
-        <w:br/>
-      </w:r>
-      <w:r>
-        <w:t>外婆先是一怔，随后慢慢抬手拍他的背。</w:t>
-      </w:r>
-      <w:r>
-        <w:br/>
-      </w:r>
-      <w:r>
-        <w:t>外婆：抱得着。你记着，我疼过你，这就够你走很远了。</w:t>
+        <w:t>周然（含着泪笑）：这次……我记住了。</w:t>
       </w:r>
     </w:p>
     <w:p>
       <w:r>
-        <w:t>1-11 清晨 内 老屋杂物间</w:t>
+        <w:t>【角色分析】</w:t>
       </w:r>
       <w:r>
         <w:br/>
       </w:r>
       <w:r>
-        <w:t>△ 天光微亮，周然猛地从杂物间惊醒，手里还死死攥着那张旧照片。</w:t>
+        <w:t>• 周然：不是简单穿越者，而是一个带着成年亏欠重新闯回旧时光的人。他的每个动作都带着补偿心理。</w:t>
       </w:r>
       <w:r>
         <w:br/>
       </w:r>
       <w:r>
-        <w:t>△ 他喘着气翻过照片，发现背面多了一行昨天没有的字，字迹歪斜，却分明是外婆的手。</w:t>
+        <w:t>• 外婆：不是“被怀念的人”，而是整部戏真正稳住情感的核心。她越家常，越动人。</w:t>
       </w:r>
       <w:r>
         <w:br/>
       </w:r>
       <w:r>
-        <w:t>△ 上面写着：别总觉得来不及。想爱，就早点说。</w:t>
-      </w:r>
-      <w:r>
-        <w:br/>
-      </w:r>
-      <w:r>
-        <w:t>周然盯着那行字，眼泪一下掉下来，终于不是崩溃，而像真的被听见了。</w:t>
-      </w:r>
-      <w:r>
-        <w:br/>
-      </w:r>
-      <w:r>
-        <w:t>周然（含着泪笑）：这次……我记住了。</w:t>
+        <w:t>• 念念：小女孩线让故事多了一层轻和亮，也让周然能先通过“陪小孩”重新靠近这个家。</w:t>
       </w:r>
     </w:p>
     <w:p>
       <w:r>
-        <w:t>【角色分析】</w:t>
+        <w:t>【教育意义/文化价值】</w:t>
       </w:r>
       <w:r>
         <w:br/>
       </w:r>
       <w:r>
-        <w:t>• 周然：不是简单穿越者，而是一个带着成年亏欠重新闯回旧时光的人。他的每个动作都带着补偿心理。</w:t>
+        <w:t>• 真正打人的亲情戏，往往不是大哭大喊，而是买药、做饭、塞钱、提醒复查这种小动作。</w:t>
       </w:r>
       <w:r>
         <w:br/>
       </w:r>
       <w:r>
-        <w:t>• 外婆：不是“被怀念的人”，而是整部戏真正稳住情感的核心。她越家常，越动人。</w:t>
+        <w:t>• 用老屋、集市、灶间、饭桌这些高识别生活空间承接情绪，落地感会很强。</w:t>
       </w:r>
       <w:r>
         <w:br/>
       </w:r>
       <w:r>
-        <w:t>• 念念：小女孩线让故事多了一层轻和亮，也让周然能先通过“陪小孩”重新靠近这个家。</w:t>
+        <w:t>• 结尾不是单纯说教，而是用一句留在旧照片背后的话温柔收口，更耐回味。</w:t>
       </w:r>
     </w:p>
     <w:p>
       <w:r>
-        <w:t>【教育意义/文化价值】</w:t>
+        <w:t>【核心爆点】</w:t>
       </w:r>
       <w:r>
         <w:br/>
       </w:r>
       <w:r>
-        <w:t>• 真正打人的亲情戏，往往不是大哭大喊，而是买药、做饭、塞钱、提醒复查这种小动作。</w:t>
+        <w:t>• 时空错位只是入口，迟到的补偿才是主钩子。</w:t>
       </w:r>
       <w:r>
         <w:br/>
       </w:r>
       <w:r>
-        <w:t>• 用老屋、集市、灶间、饭桌这些高识别生活空间承接情绪，落地感会很强。</w:t>
+        <w:t>• 中段饭桌和药铺两场戏最容易打中人，因为都是现实里最常来不及做好的事。</w:t>
       </w:r>
       <w:r>
         <w:br/>
       </w:r>
       <w:r>
-        <w:t>• 结尾不是单纯说教，而是用一句留在旧照片背后的话温柔收口，更耐回味。</w:t>
+        <w:t>• “别总觉得来不及”会让观众自动代入自己的遗憾关系。</w:t>
       </w:r>
     </w:p>
     <w:p>
       <w:r>
-        <w:t>【核心爆点】</w:t>
+        <w:t>【技术参数】</w:t>
       </w:r>
       <w:r>
         <w:br/>
       </w:r>
       <w:r>
-        <w:t>• 时空错位只是入口，迟到的补偿才是主钩子。</w:t>
+        <w:t>时长：4-5分钟</w:t>
       </w:r>
       <w:r>
         <w:br/>
       </w:r>
       <w:r>
-        <w:t>• 中段饭桌和药铺两场戏最容易打中人，因为都是现实里最常来不及做好的事。</w:t>
+        <w:t>类型：现实幻想 / 亲情治愈 / 迟到补偿</w:t>
       </w:r>
       <w:r>
         <w:br/>
       </w:r>
       <w:r>
-        <w:t>• “别总觉得来不及”会让观众自动代入自己的遗憾关系。</w:t>
+        <w:t>主要场景：老屋杂物间 / 土路 / 集市 / 药铺 / 灶间 / 饭桌 / 院门口</w:t>
+      </w:r>
+      <w:r>
+        <w:br/>
+      </w:r>
+      <w:r>
+        <w:t>改编关键词：回到过去、外婆、迟到关心、旧照片、饭桌、体检</w:t>
       </w:r>
     </w:p>
     <w:p>
       <w:r>
-        <w:t>【技术参数】</w:t>
+        <w:t>生成时间：2026-06-16</w:t>
       </w:r>
       <w:r>
         <w:br/>
       </w:r>
       <w:r>
-        <w:t>时长：4-5分钟</w:t>
+        <w:t>生成方式：扩写增强版改编脚本</w:t>
       </w:r>
       <w:r>
         <w:br/>
       </w:r>
-      <w:r>
-        <w:t>类型：现实幻想 / 亲情治愈 / 迟到补偿</w:t>
-      </w:r>
-      <w:r>
-        <w:br/>
-      </w:r>
-      <w:r>
-        <w:t>主要场景：老屋杂物间 / 土路 / 集市 / 药铺 / 灶间 / 饭桌 / 院门口</w:t>
-      </w:r>
-      <w:r>
-        <w:br/>
-      </w:r>
-      <w:r>
-        <w:t>改编关键词：回到过去、外婆、迟到关心、旧照片、饭桌、体检</w:t>
-      </w:r>
-    </w:p>
-    <w:p>
-      <w:r>
-        <w:t>生成时间：2026-06-16</w:t>
-      </w:r>
-      <w:r>
-        <w:br/>
-      </w:r>
-      <w:r>
-        <w:t>生成方式：扩写增强版改编脚本</w:t>
-      </w:r>
+      <w:r/>
     </w:p>
     <w:sectPr>
       <w:pgSz w:w="12240" w:h="15840"/>

</xml_diff>